<commit_message>
fix(lecons,veilles): cinq sources nommées sans adresse reçoivent leur page (⑭)
revenus-passifs 01 (indiehackers.com), 02 (presse.economie.gouv.fr, travail-emploi.gouv.fr
— les corrections du 02/08 nommaient la source primaire sans la lier ; chiffres vérifiés
sur la reprise DREETS Normandie), 04 (kiwezo.com, thunderbit.com — et le « 80 à 90 % dans
les quatre premiers mois » fondait deux chiffres qu'aucune page n'écrit) ; imac 30/08
(consomac.fr liée, ajoutée aux exploitées, décompte 5/11 → 6/12) ; ai-act 04/09
(artificialintelligenceact.eu liée, « ne plus tenter » retiré, ligne A4 complétée).
Journaux, ressources et fiches complétés ; exit 0 aux deux contrôles.

Co-Authored-By: Claude Opus 5 <noreply@anthropic.com>
</commit_message>
<xml_diff>
--- a/livrables/lecons/2026-07-26_lecon-revenus-passifs_01_definition-mythes.docx
+++ b/livrables/lecons/2026-07-26_lecon-revenus-passifs_01_definition-mythes.docx
@@ -1043,7 +1043,28 @@
           <w:sz w:val="22"/>
           <w:szCs w:val="22"/>
         </w:rPr>
-        <w:t xml:space="preserve">Revenu complémentaire médian en première année pour les créateurs de contenu (ebooks, formations) : souvent inférieur à quelques centaines d'euros par mois, selon les retours d'expérience de la communauté Indie Hackers (indiehackers.com, consultés mais non agrégés en chiffre précis — données non trouvées sous forme statistique exploitable).</w:t>
+        <w:t xml:space="preserve">Revenu complémentaire médian en première année pour les créateurs de contenu (ebooks, formations) : souvent inférieur à quelques centaines d'euros par mois, selon les retours d'expérience de la communauté Indie Hackers (</w:t>
+      </w:r>
+      <w:hyperlink w:history="1" r:id="rIdih2026">
+        <w:r>
+          <w:rPr>
+            <w:rFonts w:ascii="Times New Roman" w:cs="Times New Roman" w:eastAsia="Times New Roman" w:hAnsi="Times New Roman"/>
+            <w:sz w:val="22"/>
+            <w:szCs w:val="22"/>
+            <w:color w:val="1155CC"/>
+            <w:u w:val="single"/>
+          </w:rPr>
+          <w:t xml:space="preserve">indiehackers.com</w:t>
+        </w:r>
+      </w:hyperlink>
+      <w:r>
+        <w:rPr>
+          <w:rFonts w:ascii="Times New Roman" w:cs="Times New Roman" w:eastAsia="Times New Roman" w:hAnsi="Times New Roman"/>
+          <w:color w:val="1F2937"/>
+          <w:sz w:val="22"/>
+          <w:szCs w:val="22"/>
+        </w:rPr>
+        <w:t xml:space="preserve">, lien ajouté le 12/09/2026, consultés mais non agrégés en chiffre précis — données non trouvées sous forme statistique exploitable).</w:t>
       </w:r>
     </w:p>
     <w:p>
@@ -3304,6 +3325,32 @@
       </w:hyperlink>
     </w:p>
     <w:p>
+      <w:pPr>
+        <w:spacing w:after="60" w:before="60"/>
+      </w:pPr>
+      <w:r>
+        <w:rPr>
+          <w:rFonts w:ascii="Times New Roman" w:cs="Times New Roman" w:eastAsia="Times New Roman" w:hAnsi="Times New Roman"/>
+          <w:color w:val="1F2937"/>
+          <w:sz w:val="22"/>
+          <w:szCs w:val="22"/>
+        </w:rPr>
+        <w:t xml:space="preserve">8. Indie Hackers — communauté de créateurs indépendants (retours d'expérience cités dans la section Mythes ; ajoutée le 12/09/2026) : </w:t>
+      </w:r>
+      <w:hyperlink w:history="1" r:id="rIdih2026">
+        <w:r>
+          <w:rPr>
+            <w:rFonts w:ascii="Times New Roman" w:cs="Times New Roman" w:eastAsia="Times New Roman" w:hAnsi="Times New Roman"/>
+            <w:color w:val="1155CC"/>
+            <w:sz w:val="22"/>
+            <w:szCs w:val="22"/>
+            <w:u w:val="single"/>
+          </w:rPr>
+          <w:t xml:space="preserve">indiehackers.com</w:t>
+        </w:r>
+      </w:hyperlink>
+    </w:p>
+    <w:p>
       <w:r>
         <w:t xml:space="preserve"/>
       </w:r>
@@ -3472,6 +3519,50 @@
           <w:szCs w:val="18"/>
         </w:rPr>
         <w:t xml:space="preserve">Parcours Revenus passifs — Usage personnel — Document éducatif généraliste — Pas de conseil en investissement</w:t>
+      </w:r>
+    </w:p>
+    <w:p>
+      <w:pPr>
+        <w:spacing w:after="120" w:before="320"/>
+      </w:pPr>
+      <w:r>
+        <w:rPr>
+          <w:rFonts w:ascii="Times New Roman" w:cs="Times New Roman" w:eastAsia="Times New Roman" w:hAnsi="Times New Roman"/>
+          <w:b/>
+          <w:bCs/>
+          <w:color w:val="1B3A6B"/>
+          <w:sz w:val="28"/>
+          <w:szCs w:val="28"/>
+        </w:rPr>
+        <w:t xml:space="preserve">📝 Journal des corrections — 12 septembre 2026</w:t>
+      </w:r>
+    </w:p>
+    <w:p>
+      <w:pPr>
+        <w:spacing w:after="80"/>
+      </w:pPr>
+      <w:r>
+        <w:rPr>
+          <w:rFonts w:ascii="Times New Roman" w:cs="Times New Roman" w:eastAsia="Times New Roman" w:hAnsi="Times New Roman"/>
+          <w:color w:val="1F2937"/>
+          <w:sz w:val="22"/>
+          <w:szCs w:val="22"/>
+        </w:rPr>
+        <w:t xml:space="preserve">Leçon produite le 26/07/2026, relue le 12/09/2026 au cours d'un contrôle d'attribution des 221 documents du dépôt. Une correction de forme.</w:t>
+      </w:r>
+    </w:p>
+    <w:p>
+      <w:pPr>
+        <w:spacing w:after="80"/>
+      </w:pPr>
+      <w:r>
+        <w:rPr>
+          <w:rFonts w:ascii="Times New Roman" w:cs="Times New Roman" w:eastAsia="Times New Roman" w:hAnsi="Times New Roman"/>
+          <w:color w:val="1F2937"/>
+          <w:sz w:val="22"/>
+          <w:szCs w:val="22"/>
+        </w:rPr>
+        <w:t xml:space="preserve">La section Mythes attribuait un ordre de grandeur (« souvent inférieur à quelques centaines d'euros par mois ») aux « retours d'expérience de la communauté Indie Hackers (indiehackers.com, consultés mais non agrégés en chiffre précis) » — un site nommé comme source sans aucune adresse dans la leçon. Le lien est posé dans la phrase et la ressource ajoutée en n°8. L'affirmation elle-même est inchangée : la leçon disait déjà qu'elle ne repose sur aucune statistique exploitable.</w:t>
       </w:r>
     </w:p>
     <w:sectPr>

</xml_diff>